<commit_message>
Version 3.0 Agregamos la creacion de nueva cuadrilla y seleccion de por dia / destajo
</commit_message>
<xml_diff>
--- a/Capturador Destajos README.docx
+++ b/Capturador Destajos README.docx
@@ -424,8 +424,6 @@
       </w:r>
       <w:r>
         <w:br/>
-      </w:r>
-      <w:r>
         <w:t>DESTAJOS FLET/</w:t>
       </w:r>
     </w:p>
@@ -776,14 +774,439 @@
       </w:r>
     </w:p>
     <w:p>
+      <w:r>
+        <w:t>└── README.md</w:t>
+      </w:r>
+    </w:p>
+    <w:p>
+      <w:r>
+        <w:br w:type="page"/>
+      </w:r>
+    </w:p>
+    <w:p>
       <w:pPr>
         <w:rPr>
           <w:u w:val="single"/>
         </w:rPr>
       </w:pPr>
       <w:r>
-        <w:t>└── README.md</w:t>
-      </w:r>
+        <w:rPr>
+          <w:u w:val="single"/>
+        </w:rPr>
+        <w:lastRenderedPageBreak/>
+        <w:t>Obra</w:t>
+      </w:r>
+    </w:p>
+    <w:p>
+      <w:pPr>
+        <w:rPr>
+          <w:u w:val="single"/>
+        </w:rPr>
+      </w:pPr>
+      <w:r>
+        <w:rPr>
+          <w:u w:val="single"/>
+        </w:rPr>
+        <w:t xml:space="preserve"> </w:t>
+      </w:r>
+      <w:r>
+        <w:rPr>
+          <w:rFonts w:ascii="MS Gothic" w:eastAsia="MS Gothic" w:hAnsi="MS Gothic" w:cs="MS Gothic" w:hint="eastAsia"/>
+          <w:u w:val="single"/>
+        </w:rPr>
+        <w:t>├</w:t>
+      </w:r>
+      <w:r>
+        <w:rPr>
+          <w:rFonts w:ascii="Aptos" w:hAnsi="Aptos" w:cs="Aptos"/>
+          <w:u w:val="single"/>
+        </w:rPr>
+        <w:t>─</w:t>
+      </w:r>
+      <w:r>
+        <w:rPr>
+          <w:u w:val="single"/>
+        </w:rPr>
+        <w:t xml:space="preserve"> Cuadrilla 1</w:t>
+      </w:r>
+    </w:p>
+    <w:p>
+      <w:pPr>
+        <w:rPr>
+          <w:u w:val="single"/>
+        </w:rPr>
+      </w:pPr>
+      <w:r>
+        <w:rPr>
+          <w:u w:val="single"/>
+        </w:rPr>
+        <w:t xml:space="preserve"> │   </w:t>
+      </w:r>
+      <w:r>
+        <w:rPr>
+          <w:rFonts w:ascii="MS Gothic" w:eastAsia="MS Gothic" w:hAnsi="MS Gothic" w:cs="MS Gothic" w:hint="eastAsia"/>
+          <w:u w:val="single"/>
+        </w:rPr>
+        <w:t>├</w:t>
+      </w:r>
+      <w:r>
+        <w:rPr>
+          <w:rFonts w:ascii="Aptos" w:hAnsi="Aptos" w:cs="Aptos"/>
+          <w:u w:val="single"/>
+        </w:rPr>
+        <w:t>─</w:t>
+      </w:r>
+      <w:r>
+        <w:rPr>
+          <w:u w:val="single"/>
+        </w:rPr>
+        <w:t xml:space="preserve"> Trabajador 1</w:t>
+      </w:r>
+    </w:p>
+    <w:p>
+      <w:pPr>
+        <w:rPr>
+          <w:u w:val="single"/>
+        </w:rPr>
+      </w:pPr>
+      <w:r>
+        <w:rPr>
+          <w:u w:val="single"/>
+        </w:rPr>
+        <w:t xml:space="preserve"> │   </w:t>
+      </w:r>
+      <w:r>
+        <w:rPr>
+          <w:rFonts w:ascii="MS Gothic" w:eastAsia="MS Gothic" w:hAnsi="MS Gothic" w:cs="MS Gothic" w:hint="eastAsia"/>
+          <w:u w:val="single"/>
+        </w:rPr>
+        <w:t>├</w:t>
+      </w:r>
+      <w:r>
+        <w:rPr>
+          <w:rFonts w:ascii="Aptos" w:hAnsi="Aptos" w:cs="Aptos"/>
+          <w:u w:val="single"/>
+        </w:rPr>
+        <w:t>─</w:t>
+      </w:r>
+      <w:r>
+        <w:rPr>
+          <w:u w:val="single"/>
+        </w:rPr>
+        <w:t xml:space="preserve"> Trabajador 2</w:t>
+      </w:r>
+    </w:p>
+    <w:p>
+      <w:pPr>
+        <w:rPr>
+          <w:u w:val="single"/>
+        </w:rPr>
+      </w:pPr>
+      <w:r>
+        <w:rPr>
+          <w:u w:val="single"/>
+        </w:rPr>
+        <w:t xml:space="preserve"> │   </w:t>
+      </w:r>
+      <w:r>
+        <w:rPr>
+          <w:rFonts w:ascii="MS Gothic" w:eastAsia="MS Gothic" w:hAnsi="MS Gothic" w:cs="MS Gothic" w:hint="eastAsia"/>
+          <w:u w:val="single"/>
+        </w:rPr>
+        <w:t>├</w:t>
+      </w:r>
+      <w:r>
+        <w:rPr>
+          <w:rFonts w:ascii="Aptos" w:hAnsi="Aptos" w:cs="Aptos"/>
+          <w:u w:val="single"/>
+        </w:rPr>
+        <w:t>─</w:t>
+      </w:r>
+      <w:r>
+        <w:rPr>
+          <w:u w:val="single"/>
+        </w:rPr>
+        <w:t xml:space="preserve"> Concepto 1</w:t>
+      </w:r>
+    </w:p>
+    <w:p>
+      <w:pPr>
+        <w:rPr>
+          <w:u w:val="single"/>
+        </w:rPr>
+      </w:pPr>
+      <w:r>
+        <w:rPr>
+          <w:u w:val="single"/>
+        </w:rPr>
+        <w:t xml:space="preserve"> │   </w:t>
+      </w:r>
+      <w:r>
+        <w:rPr>
+          <w:rFonts w:ascii="MS Gothic" w:eastAsia="MS Gothic" w:hAnsi="MS Gothic" w:cs="MS Gothic" w:hint="eastAsia"/>
+          <w:u w:val="single"/>
+        </w:rPr>
+        <w:t>├</w:t>
+      </w:r>
+      <w:r>
+        <w:rPr>
+          <w:rFonts w:ascii="Aptos" w:hAnsi="Aptos" w:cs="Aptos"/>
+          <w:u w:val="single"/>
+        </w:rPr>
+        <w:t>─</w:t>
+      </w:r>
+      <w:r>
+        <w:rPr>
+          <w:u w:val="single"/>
+        </w:rPr>
+        <w:t xml:space="preserve"> Concepto 2</w:t>
+      </w:r>
+    </w:p>
+    <w:p>
+      <w:pPr>
+        <w:rPr>
+          <w:u w:val="single"/>
+        </w:rPr>
+      </w:pPr>
+      <w:r>
+        <w:rPr>
+          <w:u w:val="single"/>
+        </w:rPr>
+        <w:t xml:space="preserve"> │   └─ Subtitulo</w:t>
+      </w:r>
+    </w:p>
+    <w:p>
+      <w:pPr>
+        <w:rPr>
+          <w:u w:val="single"/>
+        </w:rPr>
+      </w:pPr>
+      <w:r>
+        <w:rPr>
+          <w:u w:val="single"/>
+        </w:rPr>
+        <w:t xml:space="preserve"> │</w:t>
+      </w:r>
+    </w:p>
+    <w:p>
+      <w:pPr>
+        <w:rPr>
+          <w:u w:val="single"/>
+        </w:rPr>
+      </w:pPr>
+      <w:r>
+        <w:rPr>
+          <w:u w:val="single"/>
+        </w:rPr>
+        <w:t xml:space="preserve"> </w:t>
+      </w:r>
+      <w:r>
+        <w:rPr>
+          <w:rFonts w:ascii="MS Gothic" w:eastAsia="MS Gothic" w:hAnsi="MS Gothic" w:cs="MS Gothic" w:hint="eastAsia"/>
+          <w:u w:val="single"/>
+        </w:rPr>
+        <w:t>├</w:t>
+      </w:r>
+      <w:r>
+        <w:rPr>
+          <w:rFonts w:ascii="Aptos" w:hAnsi="Aptos" w:cs="Aptos"/>
+          <w:u w:val="single"/>
+        </w:rPr>
+        <w:t>─</w:t>
+      </w:r>
+      <w:r>
+        <w:rPr>
+          <w:u w:val="single"/>
+        </w:rPr>
+        <w:t xml:space="preserve"> Cuadrilla 2</w:t>
+      </w:r>
+    </w:p>
+    <w:p>
+      <w:pPr>
+        <w:rPr>
+          <w:u w:val="single"/>
+        </w:rPr>
+      </w:pPr>
+      <w:r>
+        <w:rPr>
+          <w:u w:val="single"/>
+        </w:rPr>
+        <w:t xml:space="preserve"> │   </w:t>
+      </w:r>
+      <w:r>
+        <w:rPr>
+          <w:rFonts w:ascii="MS Gothic" w:eastAsia="MS Gothic" w:hAnsi="MS Gothic" w:cs="MS Gothic" w:hint="eastAsia"/>
+          <w:u w:val="single"/>
+        </w:rPr>
+        <w:t>├</w:t>
+      </w:r>
+      <w:r>
+        <w:rPr>
+          <w:rFonts w:ascii="Aptos" w:hAnsi="Aptos" w:cs="Aptos"/>
+          <w:u w:val="single"/>
+        </w:rPr>
+        <w:t>─</w:t>
+      </w:r>
+      <w:r>
+        <w:rPr>
+          <w:u w:val="single"/>
+        </w:rPr>
+        <w:t xml:space="preserve"> Trabajador</w:t>
+      </w:r>
+    </w:p>
+    <w:p>
+      <w:pPr>
+        <w:rPr>
+          <w:u w:val="single"/>
+        </w:rPr>
+      </w:pPr>
+      <w:r>
+        <w:rPr>
+          <w:u w:val="single"/>
+        </w:rPr>
+        <w:t xml:space="preserve"> │   └─ Pago por día</w:t>
+      </w:r>
+    </w:p>
+    <w:p>
+      <w:pPr>
+        <w:rPr>
+          <w:u w:val="single"/>
+        </w:rPr>
+      </w:pPr>
+      <w:r>
+        <w:rPr>
+          <w:u w:val="single"/>
+        </w:rPr>
+        <w:t xml:space="preserve"> │</w:t>
+      </w:r>
+    </w:p>
+    <w:p>
+      <w:pPr>
+        <w:rPr>
+          <w:u w:val="single"/>
+        </w:rPr>
+      </w:pPr>
+      <w:r>
+        <w:rPr>
+          <w:u w:val="single"/>
+        </w:rPr>
+        <w:t xml:space="preserve"> └─ Cuadrilla 3</w:t>
+      </w:r>
+    </w:p>
+    <w:p>
+      <w:pPr>
+        <w:rPr>
+          <w:u w:val="single"/>
+        </w:rPr>
+      </w:pPr>
+      <w:r>
+        <w:rPr>
+          <w:u w:val="single"/>
+        </w:rPr>
+        <w:t xml:space="preserve">     </w:t>
+      </w:r>
+      <w:r>
+        <w:rPr>
+          <w:rFonts w:ascii="MS Gothic" w:eastAsia="MS Gothic" w:hAnsi="MS Gothic" w:cs="MS Gothic" w:hint="eastAsia"/>
+          <w:u w:val="single"/>
+        </w:rPr>
+        <w:t>├</w:t>
+      </w:r>
+      <w:r>
+        <w:rPr>
+          <w:rFonts w:ascii="Aptos" w:hAnsi="Aptos" w:cs="Aptos"/>
+          <w:u w:val="single"/>
+        </w:rPr>
+        <w:t>─</w:t>
+      </w:r>
+      <w:r>
+        <w:rPr>
+          <w:u w:val="single"/>
+        </w:rPr>
+        <w:t xml:space="preserve"> Trabajador 1</w:t>
+      </w:r>
+    </w:p>
+    <w:p>
+      <w:pPr>
+        <w:rPr>
+          <w:u w:val="single"/>
+        </w:rPr>
+      </w:pPr>
+      <w:r>
+        <w:rPr>
+          <w:u w:val="single"/>
+        </w:rPr>
+        <w:t xml:space="preserve">     </w:t>
+      </w:r>
+      <w:r>
+        <w:rPr>
+          <w:rFonts w:ascii="MS Gothic" w:eastAsia="MS Gothic" w:hAnsi="MS Gothic" w:cs="MS Gothic" w:hint="eastAsia"/>
+          <w:u w:val="single"/>
+        </w:rPr>
+        <w:t>├</w:t>
+      </w:r>
+      <w:r>
+        <w:rPr>
+          <w:rFonts w:ascii="Aptos" w:hAnsi="Aptos" w:cs="Aptos"/>
+          <w:u w:val="single"/>
+        </w:rPr>
+        <w:t>─</w:t>
+      </w:r>
+      <w:r>
+        <w:rPr>
+          <w:u w:val="single"/>
+        </w:rPr>
+        <w:t xml:space="preserve"> Trabajador 2</w:t>
+      </w:r>
+    </w:p>
+    <w:p>
+      <w:pPr>
+        <w:rPr>
+          <w:u w:val="single"/>
+        </w:rPr>
+      </w:pPr>
+      <w:r>
+        <w:rPr>
+          <w:u w:val="single"/>
+        </w:rPr>
+        <w:t xml:space="preserve">     </w:t>
+      </w:r>
+      <w:r>
+        <w:rPr>
+          <w:rFonts w:ascii="MS Gothic" w:eastAsia="MS Gothic" w:hAnsi="MS Gothic" w:cs="MS Gothic" w:hint="eastAsia"/>
+          <w:u w:val="single"/>
+        </w:rPr>
+        <w:t>├</w:t>
+      </w:r>
+      <w:r>
+        <w:rPr>
+          <w:rFonts w:ascii="Aptos" w:hAnsi="Aptos" w:cs="Aptos"/>
+          <w:u w:val="single"/>
+        </w:rPr>
+        <w:t>─</w:t>
+      </w:r>
+      <w:r>
+        <w:rPr>
+          <w:u w:val="single"/>
+        </w:rPr>
+        <w:t xml:space="preserve"> Conceptos</w:t>
+      </w:r>
+    </w:p>
+    <w:p>
+      <w:r>
+        <w:rPr>
+          <w:u w:val="single"/>
+        </w:rPr>
+        <w:t xml:space="preserve">     └─ </w:t>
+      </w:r>
+      <w:proofErr w:type="spellStart"/>
+      <w:r>
+        <w:rPr>
+          <w:u w:val="single"/>
+        </w:rPr>
+        <w:t>Subtitulos</w:t>
+      </w:r>
+      <w:proofErr w:type="spellEnd"/>
     </w:p>
     <w:p/>
     <w:sectPr>

</xml_diff>